<commit_message>
fix Q&A numbering: renumber Q15-Q16 to Q14-Q15 after Q14 removal
</commit_message>
<xml_diff>
--- a/docs/RetailCo_QA_Explanation.docx
+++ b/docs/RetailCo_QA_Explanation.docx
@@ -3771,7 +3771,7 @@
                 <w:sz w:val="18"/>
                 <w:szCs w:val="18"/>
               </w:rPr>
-              <w:t xml:space="preserve">Q15  </w:t>
+              <w:t xml:space="preserve">Q14  </w:t>
             </w:r>
             <w:r>
               <w:rPr>
@@ -3972,7 +3972,7 @@
                 <w:sz w:val="18"/>
                 <w:szCs w:val="18"/>
               </w:rPr>
-              <w:t xml:space="preserve">Q16  </w:t>
+              <w:t xml:space="preserve">Q15  </w:t>
             </w:r>
             <w:r>
               <w:rPr>

</xml_diff>